<commit_message>
Refatora Executor, remove bot_email e adiciona nova interface conversacional
</commit_message>
<xml_diff>
--- a/services/templates/modelo_hipossuficiencia.docx
+++ b/services/templates/modelo_hipossuficiencia.docx
@@ -107,15 +107,11 @@
         </w:tabs>
         <w:spacing w:before="0" w:after="120"/>
         <w:jc w:val="both"/>
-        <w:rPr>
-          <w:rFonts w:ascii="Microsoft JhengHei" w:hAnsi="Microsoft JhengHei" w:eastAsia="Microsoft JhengHei" w:cs="Tahoma"/>
-          <w:sz w:val="20"/>
-          <w:szCs w:val="20"/>
-        </w:rPr>
-      </w:pPr>
-      <w:r>
-        <w:rPr>
-          <w:rFonts w:eastAsia="Microsoft JhengHei" w:ascii="Microsoft JhengHei" w:hAnsi="Microsoft JhengHei"/>
+        <w:rPr/>
+      </w:pPr>
+      <w:r>
+        <w:rPr>
+          <w:rFonts w:eastAsia="Microsoft JhengHei" w:ascii="Mircrosoft Yahei" w:hAnsi="Mircrosoft Yahei"/>
           <w:b/>
           <w:bCs/>
           <w:sz w:val="20"/>
@@ -125,37 +121,43 @@
       </w:r>
       <w:r>
         <w:rPr>
-          <w:rFonts w:eastAsia="Microsoft JhengHei" w:ascii="Microsoft JhengHei" w:hAnsi="Microsoft JhengHei"/>
+          <w:rStyle w:val="Fontepargpadro"/>
+          <w:rFonts w:eastAsia="Microsoft JhengHei" w:cs="Calisto MT;KENPLP+TimesNewRoman" w:ascii="Mircrosoft Yahei" w:hAnsi="Mircrosoft Yahei"/>
+          <w:b/>
+          <w:bCs/>
+          <w:color w:val="1D1B11"/>
+          <w:sz w:val="20"/>
+          <w:szCs w:val="20"/>
+        </w:rPr>
+        <w:t>{{nome}},</w:t>
+      </w:r>
+      <w:r>
+        <w:rPr>
+          <w:rStyle w:val="Fontepargpadro"/>
+          <w:rFonts w:eastAsia="Microsoft JhengHei" w:cs="Calisto MT;KENPLP+TimesNewRoman" w:ascii="Mircrosoft Yahei" w:hAnsi="Mircrosoft Yahei"/>
           <w:b w:val="false"/>
           <w:bCs w:val="false"/>
-          <w:sz w:val="20"/>
-          <w:szCs w:val="20"/>
-        </w:rPr>
-        <w:t>{{nome}},</w:t>
-      </w:r>
-      <w:r>
-        <w:rPr>
-          <w:rFonts w:eastAsia="Microsoft JhengHei" w:ascii="Microsoft JhengHei" w:hAnsi="Microsoft JhengHei"/>
-          <w:b/>
-          <w:bCs/>
-          <w:sz w:val="20"/>
-          <w:szCs w:val="20"/>
-        </w:rPr>
-        <w:t xml:space="preserve"> </w:t>
-      </w:r>
-      <w:r>
-        <w:rPr>
-          <w:rFonts w:eastAsia="Microsoft JhengHei" w:ascii="Microsoft JhengHei" w:hAnsi="Microsoft JhengHei"/>
+          <w:color w:val="1D1B11"/>
+          <w:sz w:val="20"/>
+          <w:szCs w:val="20"/>
+        </w:rPr>
+        <w:t xml:space="preserve"> {{nacionalidade}}, {{estado_civil}}, {{profissao}}, inscrito(a) no CPF sob o nº {{cpf}}, nascido(a) em {{data_nascimento}}</w:t>
+      </w:r>
+      <w:r>
+        <w:rPr>
+          <w:rStyle w:val="Fontepargpadro"/>
+          <w:rFonts w:eastAsia="Microsoft YaHei" w:cs="Calisto MT;KENPLP+TimesNewRoman" w:ascii="Mircrosoft Yahei" w:hAnsi="Mircrosoft Yahei"/>
           <w:b w:val="false"/>
           <w:bCs w:val="false"/>
-          <w:sz w:val="20"/>
-          <w:szCs w:val="20"/>
-        </w:rPr>
-        <w:t>{{nacionalidade}}, {{estado_civil}}, {{profissao}}, CPF: {{cpf}}, Endereço: {{endereco}}, Email: {{email}}</w:t>
-      </w:r>
-      <w:r>
-        <w:rPr>
-          <w:rFonts w:eastAsia="Microsoft JhengHei" w:ascii="Microsoft JhengHei" w:hAnsi="Microsoft JhengHei"/>
+          <w:color w:val="1D1B11"/>
+          <w:sz w:val="20"/>
+          <w:szCs w:val="20"/>
+        </w:rPr>
+        <w:t>, residente e domiciliado(a) em {{endereco}}, e-mail {{email}}</w:t>
+      </w:r>
+      <w:r>
+        <w:rPr>
+          <w:rFonts w:eastAsia="Microsoft JhengHei" w:ascii="Mircrosoft Yahei" w:hAnsi="Mircrosoft Yahei"/>
           <w:b/>
           <w:sz w:val="20"/>
           <w:szCs w:val="20"/>
@@ -164,7 +166,7 @@
       </w:r>
       <w:r>
         <w:rPr>
-          <w:rFonts w:eastAsia="Microsoft JhengHei" w:cs="Tahoma" w:ascii="Microsoft JhengHei" w:hAnsi="Microsoft JhengHei"/>
+          <w:rFonts w:eastAsia="Microsoft JhengHei" w:cs="Tahoma" w:ascii="Mircrosoft Yahei" w:hAnsi="Mircrosoft Yahei"/>
           <w:sz w:val="20"/>
           <w:szCs w:val="20"/>
         </w:rPr>
@@ -177,14 +179,12 @@
         <w:spacing w:before="0" w:after="120"/>
         <w:jc w:val="both"/>
         <w:rPr>
-          <w:rFonts w:ascii="Microsoft JhengHei" w:hAnsi="Microsoft JhengHei" w:eastAsia="Microsoft JhengHei" w:cs="Tahoma"/>
-          <w:sz w:val="20"/>
-          <w:szCs w:val="20"/>
-        </w:rPr>
-      </w:pPr>
-      <w:r>
-        <w:rPr>
-          <w:rFonts w:eastAsia="Microsoft JhengHei" w:cs="Tahoma" w:ascii="Microsoft JhengHei" w:hAnsi="Microsoft JhengHei"/>
+          <w:rFonts w:ascii="Mircrosoft Yahei" w:hAnsi="Mircrosoft Yahei"/>
+        </w:rPr>
+      </w:pPr>
+      <w:r>
+        <w:rPr>
+          <w:rFonts w:eastAsia="Microsoft JhengHei" w:cs="Tahoma" w:ascii="Mircrosoft Yahei" w:hAnsi="Mircrosoft Yahei"/>
           <w:sz w:val="20"/>
           <w:szCs w:val="20"/>
         </w:rPr>
@@ -686,10 +686,6 @@
     </w:pPr>
     <w:r>
       <w:rPr/>
-      <w:tab/>
-    </w:r>
-    <w:r>
-      <w:rPr/>
       <w:drawing>
         <wp:inline distT="0" distB="0" distL="0" distR="0">
           <wp:extent cx="2096770" cy="894715"/>
@@ -740,10 +736,6 @@
       <w:jc w:val="center"/>
       <w:rPr/>
     </w:pPr>
-    <w:r>
-      <w:rPr/>
-      <w:tab/>
-    </w:r>
     <w:r>
       <w:rPr/>
       <w:drawing>
@@ -811,7 +803,7 @@
     <w:pPr>
       <w:widowControl/>
       <w:suppressAutoHyphens w:val="true"/>
-      <w:overflowPunct w:val="true"/>
+      <w:overflowPunct w:val="false"/>
       <w:bidi w:val="0"/>
       <w:spacing w:lineRule="auto" w:line="276" w:before="0" w:after="200"/>
       <w:jc w:val="start"/>
@@ -860,6 +852,11 @@
       <w:b/>
       <w:bCs/>
     </w:rPr>
+  </w:style>
+  <w:style w:type="character" w:styleId="Fontepargpadro">
+    <w:name w:val="Fonte parág. padrão"/>
+    <w:qFormat/>
+    <w:rPr/>
   </w:style>
   <w:style w:type="paragraph" w:styleId="Ttulo">
     <w:name w:val="Título"/>

</xml_diff>